<commit_message>
Add repository link to project documentation
</commit_message>
<xml_diff>
--- a/Ficha_Proyecto_Movilidad_Siniestralidad_Vial.docx
+++ b/Ficha_Proyecto_Movilidad_Siniestralidad_Vial.docx
@@ -257,15 +257,15 @@
         <w:tblLook w:val="04a0" w:firstRow="1" w:noVBand="1" w:lastRow="0" w:firstColumn="1" w:lastColumn="0" w:noHBand="0"/>
       </w:tblPr>
       <w:tblGrid>
-        <w:gridCol w:w="1598"/>
-        <w:gridCol w:w="3602"/>
+        <w:gridCol w:w="1597"/>
+        <w:gridCol w:w="3603"/>
         <w:gridCol w:w="4160"/>
       </w:tblGrid>
       <w:tr>
         <w:trPr/>
         <w:tc>
           <w:tcPr>
-            <w:tcW w:w="1598" w:type="dxa"/>
+            <w:tcW w:w="1597" w:type="dxa"/>
             <w:tcBorders>
               <w:top w:val="single" w:sz="4" w:space="0" w:color="000000"/>
               <w:start w:val="single" w:sz="4" w:space="0" w:color="000000"/>
@@ -293,7 +293,7 @@
         </w:tc>
         <w:tc>
           <w:tcPr>
-            <w:tcW w:w="3602" w:type="dxa"/>
+            <w:tcW w:w="3603" w:type="dxa"/>
             <w:tcBorders>
               <w:top w:val="single" w:sz="4" w:space="0" w:color="000000"/>
               <w:start w:val="single" w:sz="4" w:space="0" w:color="000000"/>
@@ -352,7 +352,7 @@
         <w:trPr/>
         <w:tc>
           <w:tcPr>
-            <w:tcW w:w="1598" w:type="dxa"/>
+            <w:tcW w:w="1597" w:type="dxa"/>
             <w:tcBorders>
               <w:top w:val="single" w:sz="4" w:space="0" w:color="000000"/>
               <w:start w:val="single" w:sz="4" w:space="0" w:color="000000"/>
@@ -377,7 +377,7 @@
         </w:tc>
         <w:tc>
           <w:tcPr>
-            <w:tcW w:w="3602" w:type="dxa"/>
+            <w:tcW w:w="3603" w:type="dxa"/>
             <w:tcBorders>
               <w:top w:val="single" w:sz="4" w:space="0" w:color="000000"/>
               <w:start w:val="single" w:sz="4" w:space="0" w:color="000000"/>
@@ -430,7 +430,7 @@
         <w:trPr/>
         <w:tc>
           <w:tcPr>
-            <w:tcW w:w="1598" w:type="dxa"/>
+            <w:tcW w:w="1597" w:type="dxa"/>
             <w:tcBorders>
               <w:top w:val="single" w:sz="4" w:space="0" w:color="000000"/>
               <w:start w:val="single" w:sz="4" w:space="0" w:color="000000"/>
@@ -455,7 +455,7 @@
         </w:tc>
         <w:tc>
           <w:tcPr>
-            <w:tcW w:w="3602" w:type="dxa"/>
+            <w:tcW w:w="3603" w:type="dxa"/>
             <w:tcBorders>
               <w:top w:val="single" w:sz="4" w:space="0" w:color="000000"/>
               <w:start w:val="single" w:sz="4" w:space="0" w:color="000000"/>
@@ -508,7 +508,7 @@
         <w:trPr/>
         <w:tc>
           <w:tcPr>
-            <w:tcW w:w="1598" w:type="dxa"/>
+            <w:tcW w:w="1597" w:type="dxa"/>
             <w:tcBorders>
               <w:top w:val="single" w:sz="4" w:space="0" w:color="000000"/>
               <w:start w:val="single" w:sz="4" w:space="0" w:color="000000"/>
@@ -533,7 +533,7 @@
         </w:tc>
         <w:tc>
           <w:tcPr>
-            <w:tcW w:w="3602" w:type="dxa"/>
+            <w:tcW w:w="3603" w:type="dxa"/>
             <w:tcBorders>
               <w:top w:val="single" w:sz="4" w:space="0" w:color="000000"/>
               <w:start w:val="single" w:sz="4" w:space="0" w:color="000000"/>
@@ -586,7 +586,7 @@
         <w:trPr/>
         <w:tc>
           <w:tcPr>
-            <w:tcW w:w="1598" w:type="dxa"/>
+            <w:tcW w:w="1597" w:type="dxa"/>
             <w:tcBorders>
               <w:top w:val="single" w:sz="4" w:space="0" w:color="000000"/>
               <w:start w:val="single" w:sz="4" w:space="0" w:color="000000"/>
@@ -611,7 +611,7 @@
         </w:tc>
         <w:tc>
           <w:tcPr>
-            <w:tcW w:w="3602" w:type="dxa"/>
+            <w:tcW w:w="3603" w:type="dxa"/>
             <w:tcBorders>
               <w:top w:val="single" w:sz="4" w:space="0" w:color="000000"/>
               <w:start w:val="single" w:sz="4" w:space="0" w:color="000000"/>
@@ -2686,6 +2686,10 @@
             <w:r>
               <w:rPr/>
               <w:t xml:space="preserve"> </w:t>
+            </w:r>
+            <w:r>
+              <w:rPr/>
+              <w:t>https://github.com/winderoman/mineria-siniestralidad-vial</w:t>
             </w:r>
           </w:p>
           <w:p>
@@ -4196,8 +4200,8 @@
       <w:u w:val="single"/>
     </w:rPr>
   </w:style>
-  <w:style w:type="character" w:styleId="Caracteresdenotaalpieuser">
-    <w:name w:val="Caracteres de nota al pie (user)"/>
+  <w:style w:type="character" w:styleId="Caracteresdenotaalpie">
+    <w:name w:val="Caracteres de nota al pie"/>
     <w:uiPriority w:val="99"/>
     <w:semiHidden/>
     <w:unhideWhenUsed/>
@@ -4206,8 +4210,8 @@
       <w:vertAlign w:val="superscript"/>
     </w:rPr>
   </w:style>
-  <w:style w:type="character" w:styleId="Caracteresdenotaalpie">
-    <w:name w:val="Caracteres de nota al pie"/>
+  <w:style w:type="character" w:styleId="Caracteresdenotaalpieuser">
+    <w:name w:val="Caracteres de nota al pie (user)"/>
     <w:qFormat/>
     <w:rPr>
       <w:vertAlign w:val="superscript"/>
@@ -4230,8 +4234,8 @@
       <w:szCs w:val="20"/>
     </w:rPr>
   </w:style>
-  <w:style w:type="character" w:styleId="Caracteresdenotafinaluser">
-    <w:name w:val="Caracteres de nota final (user)"/>
+  <w:style w:type="character" w:styleId="Caracteresdenotafinal">
+    <w:name w:val="Caracteres de nota final"/>
     <w:uiPriority w:val="99"/>
     <w:semiHidden/>
     <w:unhideWhenUsed/>
@@ -4240,8 +4244,8 @@
       <w:vertAlign w:val="superscript"/>
     </w:rPr>
   </w:style>
-  <w:style w:type="character" w:styleId="Caracteresdenotafinal">
-    <w:name w:val="Caracteres de nota final"/>
+  <w:style w:type="character" w:styleId="Caracteresdenotafinaluser">
+    <w:name w:val="Caracteres de nota final (user)"/>
     <w:qFormat/>
     <w:rPr>
       <w:vertAlign w:val="superscript"/>
@@ -4452,8 +4456,8 @@
       <w:lang w:val="es-CO" w:eastAsia="es-CO" w:bidi="ar-SA"/>
     </w:rPr>
   </w:style>
-  <w:style w:type="numbering" w:styleId="Ningunalistauser" w:default="1">
-    <w:name w:val="Ninguna lista (user)"/>
+  <w:style w:type="numbering" w:styleId="Ningunalista" w:default="1">
+    <w:name w:val="Ninguna lista"/>
     <w:uiPriority w:val="99"/>
     <w:semiHidden/>
     <w:unhideWhenUsed/>

</xml_diff>